<commit_message>
Update Week 3 scheduling report
</commit_message>
<xml_diff>
--- a/Week3_Process_Scheduling/Week3_Process_Scheduling_Report.docx
+++ b/Week3_Process_Scheduling/Week3_Process_Scheduling_Report.docx
@@ -133,7 +133,7 @@
     </w:p>
     <w:p>
       <w:r>
-        <w:t>Important implementation note: CPU utilization is a required performance metric in the assignment objective. The existing program's output should be checked to confirm that it actually prints this percentage; this report's calculated values are reference results and do not by themselves add the metric to the C program.</w:t>
+        <w:t>Implementation verification: the current program was compiled and tested locally. The FCFS initial-idle test documented in Section 7 printed CPU busy time, CPU idle time, and CPU utilization. For that run, busy time was 3, idle time was 5, and utilization was 37.50%.</w:t>
       </w:r>
     </w:p>
     <w:p>
@@ -1817,12 +1817,40 @@
     </w:p>
     <w:p>
       <w:r>
-        <w:t>The team has previously compiled and run the integrated scheduler and exercised all six menu options. For final submission, attach screenshots or captured terminal output from the actual local program for the three datasets above. The reference tables in this report are hand-calculated FCFS expectations; they should not be described as screenshots or captured program output.</w:t>
+        <w:t>The integrated scheduler has been compiled and run locally. One actual FCFS run is recorded in Section 7 below. The three datasets in Sections 3–5 are hand-calculated reference expectations, not captured program output. For submission, capture actual terminal output and Gantt charts for at least three test cases.</w:t>
       </w:r>
     </w:p>
     <w:p>
       <w:r>
-        <w:t>Also run each of the other five algorithms on at least one suitable dataset and keep the resulting output if the evaluator expects evidence for every algorithm. Include at least one Round Robin run showing the selected time quantum.</w:t>
+        <w:t>For fuller evidence, run each of the other five algorithms on a suitable dataset and keep the resulting output if the evaluator expects evidence for every algorithm. Include at least one Round Robin run showing the selected time quantum.</w:t>
+      </w:r>
+    </w:p>
+    <w:p>
+      <w:pPr>
+        <w:pStyle w:val="Heading2"/>
+      </w:pPr>
+      <w:r>
+        <w:t>Verified local run — FCFS with an initial idle period</w:t>
+      </w:r>
+    </w:p>
+    <w:p>
+      <w:r>
+        <w:t>Input: one process, P1; arrival time = 5; burst time = 3; priority = 1. Algorithm selected: FCFS.</w:t>
+      </w:r>
+    </w:p>
+    <w:p>
+      <w:r>
+        <w:t>Gantt chart: 0–5 IDLE | 5–8 P1</w:t>
+      </w:r>
+    </w:p>
+    <w:p>
+      <w:r>
+        <w:t>Actual terminal output: CPU Busy Time = 3; CPU Idle Time = 5; CPU Utilization = 37.50%; CT = 8; TAT = 3; WT = 0; RT = 0; Average WT = 0.00; Average TAT = 3.00.</w:t>
+      </w:r>
+    </w:p>
+    <w:p>
+      <w:r>
+        <w:t>Calculation: elapsed time = 8 − 0 = 8. CPU utilization = (3 ÷ 8) × 100 = 37.50%. This run confirms that the initial idle interval is included in elapsed time.</w:t>
       </w:r>
     </w:p>
     <w:p>
@@ -1840,7 +1868,7 @@
     </w:p>
     <w:p>
       <w:r>
-        <w:t>☐ Confirm the actual program prints CPU utilization, not only WT/TAT/RT averages.</w:t>
+        <w:t>☑ Confirmed: the program prints CPU busy time, CPU idle time, and CPU utilization; the initial-idle case was verified locally.</w:t>
       </w:r>
     </w:p>
     <w:p>
@@ -1873,7 +1901,7 @@
     </w:p>
     <w:p>
       <w:r>
-        <w:t>The project implements the core scheduling algorithms and reports common process metrics. The test cases above cover simultaneous arrivals, staggered arrivals, and CPU idle periods. Before submission, confirm CPU utilization is implemented in the executable and replace or supplement the reference calculations with actual terminal evidence from the current project.</w:t>
+        <w:t>The project implements the core scheduling algorithms and reports common process metrics. The reference test cases cover simultaneous arrivals, staggered arrivals, and CPU idle periods. A local FCFS test also verified that an initial idle interval is included in elapsed time: P1 arrived at time 5, ran for 3 units, and produced 37.50% CPU utilization. Before submission, capture and attach actual terminal evidence for at least three test cases and retain a Round Robin run with its chosen quantum.</w:t>
       </w:r>
     </w:p>
     <w:sectPr>

</xml_diff>

<commit_message>
Update Week 3 scheduling test evidence
</commit_message>
<xml_diff>
--- a/Week3_Process_Scheduling/Week3_Process_Scheduling_Report.docx
+++ b/Week3_Process_Scheduling/Week3_Process_Scheduling_Report.docx
@@ -1817,12 +1817,12 @@
     </w:p>
     <w:p>
       <w:r>
-        <w:t>The integrated scheduler has been compiled and run locally. One actual FCFS run is recorded in Section 7 below. The three datasets in Sections 3–5 are hand-calculated reference expectations, not captured program output. For submission, capture actual terminal output and Gantt charts for at least three test cases.</w:t>
+        <w:t>The integrated scheduler was compiled with gcc -Wall -Wextra -std=c11 and ran locally. The datasets in Sections 3–5 are hand-calculated reference examples. The following additional entries summarize actual self-test output observed in the local terminal during verification; they are summaries of the terminal output, not screenshots or full log transcripts.</w:t>
       </w:r>
     </w:p>
     <w:p>
       <w:r>
-        <w:t>For fuller evidence, run each of the other five algorithms on a suitable dataset and keep the resulting output if the evaluator expects evidence for every algorithm. Include at least one Round Robin run showing the selected time quantum.</w:t>
+        <w:t>Self-test commands used: FCFS/SJF: gcc -Wall -Wextra -std=c11 -DFCFS_SJF_TEST -o test_fcfs fcfs_sjf.c &amp;&amp; ./test_fcfs; Round Robin: gcc -Wall -Wextra -std=c11 -DRR_TEST -o test_rr round_robin.c gantt.c &amp;&amp; ./test_rr; SRTF/Priority: gcc -Wall -Wextra -std=c11 -DSRTF_PRIORITY_TEST -o test_priority srtf_priority.c &amp;&amp; ./test_priority. The SRTF/Priority test build intentionally omits gantt.c because that test mode provides its own gantt_display implementation.</w:t>
       </w:r>
     </w:p>
     <w:p>
@@ -1855,6 +1855,50 @@
     </w:p>
     <w:p>
       <w:pPr>
+        <w:pStyle w:val="Heading2"/>
+      </w:pPr>
+      <w:r>
+        <w:t>7.1 Actual self-test evidence — FCFS and SJF</w:t>
+      </w:r>
+    </w:p>
+    <w:p>
+      <w:r>
+        <w:t>Test: FCFS/SJF self-test, Test 1 (all processes arrive at time 0). FCFS Gantt: [0 P1 6] [6 P2 14] [14 P3 21] [21 P4 24]. Reported averages: WT = 10.25, TAT = 16.25, RT = 10.25. SJF Gantt: [0 P4 3] [3 P1 9] [9 P3 16] [16 P2 24]. Reported averages: WT = 7.00, TAT = 13.00, RT = 7.00.</w:t>
+      </w:r>
+    </w:p>
+    <w:p>
+      <w:pPr>
+        <w:pStyle w:val="Heading2"/>
+      </w:pPr>
+      <w:r>
+        <w:t>7.2 Actual self-test evidence — SRTF and Priority</w:t>
+      </w:r>
+    </w:p>
+    <w:p>
+      <w:r>
+        <w:t>Test: SRTF/Priority self-test, Test 1. SRTF Gantt: [0 P1 1] [1 P2 5] [5 P4 10] [10 P1 17] [17 P3 26]. Reported averages: WT = 6.50, TAT = 13.00, RT = 4.25. Non-preemptive Priority Gantt: [0 P1 10] [10 P2 15] [15 P4 19] [19 P3 21]; averages WT = 9.50, TAT = 14.75, RT = 9.50. Preemptive Priority Gantt: [0 P1 1] [1 P2 6] [6 P4 10] [10 P1 19] [19 P3 21]; averages WT = 7.25, TAT = 12.50, RT = 5.00.</w:t>
+      </w:r>
+    </w:p>
+    <w:p>
+      <w:pPr>
+        <w:pStyle w:val="Heading2"/>
+      </w:pPr>
+      <w:r>
+        <w:t>7.3 Actual self-test evidence — Round Robin</w:t>
+      </w:r>
+    </w:p>
+    <w:p>
+      <w:r>
+        <w:t>Test: Round Robin self-test, arrivals during a time slice, quantum = 2. Gantt: [0 P1 2] [2 P2 4] [4 P3 5] [5 P1 7] [7 P4 9] [9 P5 11] [11 P2 12] [12 P1 13] [13 P5 14]. Reported averages: WT = 5.80, TAT = 8.60, RT = 2.40. This demonstrates that the configurable quantum changes how the CPU is shared.</w:t>
+      </w:r>
+    </w:p>
+    <w:p>
+      <w:r>
+        <w:t>Evidence note: these summaries were transcribed from the self-test terminal output shown during review. For a formal submission that requires visual proof, attach screenshots of the full terminal runs. The separate manual test cases in Sections 3–5 remain reference calculations, not actual captured runs.</w:t>
+      </w:r>
+    </w:p>
+    <w:p>
+      <w:pPr>
         <w:pStyle w:val="Heading1"/>
       </w:pPr>
       <w:r>
@@ -1863,7 +1907,7 @@
     </w:p>
     <w:p>
       <w:r>
-        <w:t>☐ Compile the integrated C sources with -Wall -Wextra -std=c11 and resolve warnings/errors.</w:t>
+        <w:t>☑ Compiled the integrated C sources with -Wall -Wextra -std=c11; no warnings/errors were reported.</w:t>
       </w:r>
     </w:p>
     <w:p>
@@ -1873,22 +1917,22 @@
     </w:p>
     <w:p>
       <w:r>
-        <w:t>☐ Capture actual program output and Gantt charts for at least three test cases.</w:t>
+        <w:t>☑ Added summaries of actual FCFS/SJF, SRTF/Priority, and Round Robin self-test output in Sections 7.1–7.3; attach screenshots if required.</w:t>
       </w:r>
     </w:p>
     <w:p>
       <w:r>
-        <w:t>☐ Include a Round Robin test with a configurable time quantum.</w:t>
+        <w:t>☑ Included a Round Robin self-test with configurable time quantum = 2 in Section 7.3.</w:t>
       </w:r>
     </w:p>
     <w:p>
       <w:r>
-        <w:t>☐ Review README.md and add build/run instructions plus test evidence.</w:t>
+        <w:t>☑ Reviewed README.md and corrected the build command; test evidence summaries are included in this report.</w:t>
       </w:r>
     </w:p>
     <w:p>
       <w:r>
-        <w:t>☐ Commit and push the final code and documentation to GitHub.</w:t>
+        <w:t>☐ Replace the repository copy with this updated report, then commit and push the report to GitHub.</w:t>
       </w:r>
     </w:p>
     <w:p>
@@ -1901,7 +1945,7 @@
     </w:p>
     <w:p>
       <w:r>
-        <w:t>The project implements the core scheduling algorithms and reports common process metrics. The reference test cases cover simultaneous arrivals, staggered arrivals, and CPU idle periods. A local FCFS test also verified that an initial idle interval is included in elapsed time: P1 arrived at time 5, ran for 3 units, and produced 37.50% CPU utilization. Before submission, capture and attach actual terminal evidence for at least three test cases and retain a Round Robin run with its chosen quantum.</w:t>
+        <w:t>The project implements the required scheduling algorithms and reports common process metrics. Reference examples cover simultaneous arrivals, staggered arrivals, and CPU idle periods. Local self-tests were also run for FCFS/SJF, SRTF/Priority, and Round Robin with quantum = 2; selected Gantt charts and averages are summarized in Sections 7.1–7.3. The initial-idle FCFS run verified busy time = 3, idle time = 5, and CPU utilization = 37.50%. Before final submission, attach full terminal screenshots if the evaluator requires them and push this updated report to GitHub.</w:t>
       </w:r>
     </w:p>
     <w:sectPr>

</xml_diff>